<commit_message>
tempo save for border render
</commit_message>
<xml_diff>
--- a/tests/examples/table.docx
+++ b/tests/examples/table.docx
@@ -1,6 +1,6 @@
 
 <file path=word/document.xml><?xml version="1.0" encoding="utf-8"?>
-<w:document xmlns:wpc="http://schemas.microsoft.com/office/word/2010/wordprocessingCanvas" xmlns:cx="http://schemas.microsoft.com/office/drawing/2014/chartex" xmlns:cx1="http://schemas.microsoft.com/office/drawing/2015/9/8/chartex" xmlns:cx2="http://schemas.microsoft.com/office/drawing/2015/10/21/chartex" xmlns:cx3="http://schemas.microsoft.com/office/drawing/2016/5/9/chartex" xmlns:cx4="http://schemas.microsoft.com/office/drawing/2016/5/10/chartex" xmlns:cx5="http://schemas.microsoft.com/office/drawing/2016/5/11/chartex" xmlns:cx6="http://schemas.microsoft.com/office/drawing/2016/5/12/chartex" xmlns:cx7="http://schemas.microsoft.com/office/drawing/2016/5/13/chartex" xmlns:cx8="http://schemas.microsoft.com/office/drawing/2016/5/14/chartex" xmlns:mc="http://schemas.openxmlformats.org/markup-compatibility/2006" xmlns:aink="http://schemas.microsoft.com/office/drawing/2016/ink" xmlns:am3d="http://schemas.microsoft.com/office/drawing/2017/model3d" xmlns:o="urn:schemas-microsoft-com:office:office" xmlns:r="http://schemas.openxmlformats.org/officeDocument/2006/relationships" xmlns:m="http://schemas.openxmlformats.org/officeDocument/2006/math" xmlns:v="urn:schemas-microsoft-com:vml" xmlns:wp14="http://schemas.microsoft.com/office/word/2010/wordprocessingDrawing" xmlns:wp="http://schemas.openxmlformats.org/drawingml/2006/wordprocessingDrawing" xmlns:w10="urn:schemas-microsoft-com:office:word" xmlns:w="http://schemas.openxmlformats.org/wordprocessingml/2006/main" xmlns:w14="http://schemas.microsoft.com/office/word/2010/wordml" xmlns:w15="http://schemas.microsoft.com/office/word/2012/wordml" xmlns:w16cex="http://schemas.microsoft.com/office/word/2018/wordml/cex" xmlns:w16cid="http://schemas.microsoft.com/office/word/2016/wordml/cid" xmlns:w16="http://schemas.microsoft.com/office/word/2018/wordml" xmlns:w16sdtdh="http://schemas.microsoft.com/office/word/2020/wordml/sdtdatahash" xmlns:w16se="http://schemas.microsoft.com/office/word/2015/wordml/symex" xmlns:wpg="http://schemas.microsoft.com/office/word/2010/wordprocessingGroup" xmlns:wpi="http://schemas.microsoft.com/office/word/2010/wordprocessingInk" xmlns:wne="http://schemas.microsoft.com/office/word/2006/wordml" xmlns:wps="http://schemas.microsoft.com/office/word/2010/wordprocessingShape" mc:Ignorable="w14 w15 w16se w16cid w16 w16cex w16sdtdh wp14">
+<w:document xmlns:wpc="http://schemas.microsoft.com/office/word/2010/wordprocessingCanvas" xmlns:cx="http://schemas.microsoft.com/office/drawing/2014/chartex" xmlns:cx1="http://schemas.microsoft.com/office/drawing/2015/9/8/chartex" xmlns:cx2="http://schemas.microsoft.com/office/drawing/2015/10/21/chartex" xmlns:cx3="http://schemas.microsoft.com/office/drawing/2016/5/9/chartex" xmlns:cx4="http://schemas.microsoft.com/office/drawing/2016/5/10/chartex" xmlns:cx5="http://schemas.microsoft.com/office/drawing/2016/5/11/chartex" xmlns:cx6="http://schemas.microsoft.com/office/drawing/2016/5/12/chartex" xmlns:cx7="http://schemas.microsoft.com/office/drawing/2016/5/13/chartex" xmlns:cx8="http://schemas.microsoft.com/office/drawing/2016/5/14/chartex" xmlns:mc="http://schemas.openxmlformats.org/markup-compatibility/2006" xmlns:aink="http://schemas.microsoft.com/office/drawing/2016/ink" xmlns:am3d="http://schemas.microsoft.com/office/drawing/2017/model3d" xmlns:o="urn:schemas-microsoft-com:office:office" xmlns:r="http://schemas.openxmlformats.org/officeDocument/2006/relationships" xmlns:m="http://schemas.openxmlformats.org/officeDocument/2006/math" xmlns:v="urn:schemas-microsoft-com:vml" xmlns:wp14="http://schemas.microsoft.com/office/word/2010/wordprocessingDrawing" xmlns:wp="http://schemas.openxmlformats.org/drawingml/2006/wordprocessingDrawing" xmlns:w10="urn:schemas-microsoft-com:office:word" xmlns:w="http://schemas.openxmlformats.org/wordprocessingml/2006/main" xmlns:w14="http://schemas.microsoft.com/office/word/2010/wordml" xmlns:w15="http://schemas.microsoft.com/office/word/2012/wordml" xmlns:w16cex="http://schemas.microsoft.com/office/word/2018/wordml/cex" xmlns:w16cid="http://schemas.microsoft.com/office/word/2016/wordml/cid" xmlns:w16="http://schemas.microsoft.com/office/word/2018/wordml" xmlns:w16se="http://schemas.microsoft.com/office/word/2015/wordml/symex" xmlns:wpg="http://schemas.microsoft.com/office/word/2010/wordprocessingGroup" xmlns:wpi="http://schemas.microsoft.com/office/word/2010/wordprocessingInk" xmlns:wne="http://schemas.microsoft.com/office/word/2006/wordml" xmlns:wps="http://schemas.microsoft.com/office/word/2010/wordprocessingShape" mc:Ignorable="w14 w15 w16se w16cid w16 w16cex wp14">
   <w:body>
     <w:tbl>
       <w:tblPr>
@@ -30,6 +30,7 @@
             <w:hideMark/>
           </w:tcPr>
           <w:p>
+            <w:bookmarkStart w:id="0" w:name="_GoBack"/>
             <w:r>
               <w:t>1</w:t>
             </w:r>
@@ -832,8 +833,15 @@
           </w:p>
         </w:tc>
       </w:tr>
+      <w:bookmarkEnd w:id="0"/>
     </w:tbl>
-    <w:p/>
+    <w:p>
+      <w:pPr>
+        <w:rPr>
+          <w:lang w:val="en-US"/>
+        </w:rPr>
+      </w:pPr>
+    </w:p>
     <w:sectPr>
       <w:pgSz w:w="11906" w:h="16838"/>
       <w:pgMar w:top="1134" w:right="850" w:bottom="1134" w:left="1701" w:header="708" w:footer="708" w:gutter="0"/>
@@ -845,7 +853,7 @@
 </file>
 
 <file path=word/styles.xml><?xml version="1.0" encoding="utf-8"?>
-<w:styles xmlns:mc="http://schemas.openxmlformats.org/markup-compatibility/2006" xmlns:r="http://schemas.openxmlformats.org/officeDocument/2006/relationships" xmlns:w="http://schemas.openxmlformats.org/wordprocessingml/2006/main" xmlns:w14="http://schemas.microsoft.com/office/word/2010/wordml" xmlns:w15="http://schemas.microsoft.com/office/word/2012/wordml" xmlns:w16cex="http://schemas.microsoft.com/office/word/2018/wordml/cex" xmlns:w16cid="http://schemas.microsoft.com/office/word/2016/wordml/cid" xmlns:w16="http://schemas.microsoft.com/office/word/2018/wordml" xmlns:w16sdtdh="http://schemas.microsoft.com/office/word/2020/wordml/sdtdatahash" xmlns:w16se="http://schemas.microsoft.com/office/word/2015/wordml/symex" mc:Ignorable="w14 w15 w16se w16cid w16 w16cex w16sdtdh">
+<w:styles xmlns:mc="http://schemas.openxmlformats.org/markup-compatibility/2006" xmlns:r="http://schemas.openxmlformats.org/officeDocument/2006/relationships" xmlns:w="http://schemas.openxmlformats.org/wordprocessingml/2006/main" xmlns:w14="http://schemas.microsoft.com/office/word/2010/wordml" xmlns:w15="http://schemas.microsoft.com/office/word/2012/wordml" xmlns:w16cex="http://schemas.microsoft.com/office/word/2018/wordml/cex" xmlns:w16cid="http://schemas.microsoft.com/office/word/2016/wordml/cid" xmlns:w16="http://schemas.microsoft.com/office/word/2018/wordml" xmlns:w16se="http://schemas.microsoft.com/office/word/2015/wordml/symex" mc:Ignorable="w14 w15 w16se w16cid w16 w16cex">
   <w:docDefaults>
     <w:rPrDefault>
       <w:rPr>
@@ -1287,12 +1295,12 @@
       <w:tblStyleColBandSize w:val="1"/>
       <w:tblInd w:w="0" w:type="nil"/>
       <w:tblBorders>
-        <w:top w:val="single" w:sz="4" w:space="0" w:color="auto"/>
-        <w:left w:val="single" w:sz="4" w:space="0" w:color="auto"/>
-        <w:bottom w:val="single" w:sz="4" w:space="0" w:color="auto"/>
-        <w:right w:val="single" w:sz="4" w:space="0" w:color="auto"/>
-        <w:insideH w:val="single" w:sz="4" w:space="0" w:color="auto"/>
-        <w:insideV w:val="single" w:sz="4" w:space="0" w:color="auto"/>
+        <w:top w:val="single" w:sz="4" w:space="0" w:color="FF0000"/>
+        <w:left w:val="single" w:sz="4" w:space="0" w:color="FF0000"/>
+        <w:bottom w:val="single" w:sz="4" w:space="0" w:color="FF0000"/>
+        <w:right w:val="single" w:sz="4" w:space="0" w:color="FF0000"/>
+        <w:insideH w:val="single" w:sz="4" w:space="0" w:color="00FF00"/>
+        <w:insideV w:val="single" w:sz="4" w:space="0" w:color="00FF00"/>
       </w:tblBorders>
     </w:tblPr>
     <w:tblStylePr w:type="firstRow">
@@ -1660,6 +1668,25 @@
         <w:u w:val="single"/>
       </w:rPr>
     </w:tblStylePr>
+  </w:style>
+  <w:style w:type="table" w:styleId="a4">
+    <w:name w:val="Table Grid"/>
+    <w:basedOn w:val="a1"/>
+    <w:uiPriority w:val="39"/>
+    <w:rsid w:val="002028FB"/>
+    <w:pPr>
+      <w:spacing w:after="0" w:line="240" w:lineRule="auto"/>
+    </w:pPr>
+    <w:tblPr>
+      <w:tblBorders>
+        <w:top w:val="single" w:sz="4" w:space="0" w:color="auto"/>
+        <w:left w:val="single" w:sz="4" w:space="0" w:color="auto"/>
+        <w:bottom w:val="single" w:sz="4" w:space="0" w:color="auto"/>
+        <w:right w:val="single" w:sz="4" w:space="0" w:color="auto"/>
+        <w:insideH w:val="single" w:sz="4" w:space="0" w:color="auto"/>
+        <w:insideV w:val="single" w:sz="4" w:space="0" w:color="auto"/>
+      </w:tblBorders>
+    </w:tblPr>
   </w:style>
 </w:styles>
 </file>
@@ -1964,7 +1991,7 @@
 </file>
 
 <file path=customXml/itemProps1.xml><?xml version="1.0" encoding="utf-8"?>
-<ds:datastoreItem xmlns:ds="http://schemas.openxmlformats.org/officeDocument/2006/customXml" ds:itemID="{A6A927E5-25EE-490F-9EDF-31AD8B63F2E7}">
+<ds:datastoreItem xmlns:ds="http://schemas.openxmlformats.org/officeDocument/2006/customXml" ds:itemID="{A8ED9556-202E-4E7A-82F4-30A9A0C66583}">
   <ds:schemaRefs>
     <ds:schemaRef ds:uri="http://schemas.openxmlformats.org/officeDocument/2006/bibliography"/>
   </ds:schemaRefs>

</xml_diff>